<commit_message>
ADDING TODAY'S WORK - 21.07.2026
</commit_message>
<xml_diff>
--- a/write_up/drafts/2_introduction/introduction_DRAFT_2.docx
+++ b/write_up/drafts/2_introduction/introduction_DRAFT_2.docx
@@ -567,7 +567,13 @@
         <w:t xml:space="preserve">exclusively </w:t>
       </w:r>
       <w:r>
-        <w:t>non-monetised software.</w:t>
+        <w:t>non-monetised</w:t>
+      </w:r>
+      <w:r>
+        <w:t>, open-source</w:t>
+      </w:r>
+      <w:r>
+        <w:t xml:space="preserve"> software.</w:t>
       </w:r>
       <w:r>
         <w:t xml:space="preserve"> </w:t>
@@ -743,7 +749,7 @@
           <w:color w:val="000000"/>
           <w:lang w:eastAsia="en-GB"/>
         </w:rPr>
-        <w:t xml:space="preserve">DE and pathway analysis results obtained by the service providers during the initial studies was used to validate this analysis pipeline; external results were </w:t>
+        <w:t xml:space="preserve">This work </w:t>
       </w:r>
       <w:r>
         <w:rPr>
@@ -751,7 +757,7 @@
           <w:color w:val="000000"/>
           <w:lang w:eastAsia="en-GB"/>
         </w:rPr>
-        <w:t xml:space="preserve">only </w:t>
+        <w:t>offers</w:t>
       </w:r>
       <w:r>
         <w:rPr>
@@ -759,7 +765,7 @@
           <w:color w:val="000000"/>
           <w:lang w:eastAsia="en-GB"/>
         </w:rPr>
-        <w:t>made available after this analysis was complete.</w:t>
+        <w:t xml:space="preserve"> a</w:t>
       </w:r>
       <w:r>
         <w:rPr>
@@ -767,7 +773,7 @@
           <w:color w:val="000000"/>
           <w:lang w:eastAsia="en-GB"/>
         </w:rPr>
-        <w:t xml:space="preserve"> This work </w:t>
+        <w:t xml:space="preserve">n alternative, non-proprietary and non-monetised </w:t>
       </w:r>
       <w:r>
         <w:rPr>
@@ -775,7 +781,7 @@
           <w:color w:val="000000"/>
           <w:lang w:eastAsia="en-GB"/>
         </w:rPr>
-        <w:t>offers</w:t>
+        <w:t>pipeline</w:t>
       </w:r>
       <w:r>
         <w:rPr>
@@ -783,7 +789,7 @@
           <w:color w:val="000000"/>
           <w:lang w:eastAsia="en-GB"/>
         </w:rPr>
-        <w:t xml:space="preserve"> a</w:t>
+        <w:t xml:space="preserve"> for DE miRNA analysis and</w:t>
       </w:r>
       <w:r>
         <w:rPr>
@@ -791,7 +797,7 @@
           <w:color w:val="000000"/>
           <w:lang w:eastAsia="en-GB"/>
         </w:rPr>
-        <w:t xml:space="preserve">n alternative, non-proprietary and non-monetised </w:t>
+        <w:t xml:space="preserve"> </w:t>
       </w:r>
       <w:r>
         <w:rPr>
@@ -799,7 +805,7 @@
           <w:color w:val="000000"/>
           <w:lang w:eastAsia="en-GB"/>
         </w:rPr>
-        <w:t>pipeline</w:t>
+        <w:t>puts forward experimental</w:t>
       </w:r>
       <w:r>
         <w:rPr>
@@ -807,7 +813,7 @@
           <w:color w:val="000000"/>
           <w:lang w:eastAsia="en-GB"/>
         </w:rPr>
-        <w:t xml:space="preserve"> for DE miRNA analysis and</w:t>
+        <w:t xml:space="preserve"> design</w:t>
       </w:r>
       <w:r>
         <w:rPr>
@@ -815,7 +821,7 @@
           <w:color w:val="000000"/>
           <w:lang w:eastAsia="en-GB"/>
         </w:rPr>
-        <w:t xml:space="preserve"> </w:t>
+        <w:t xml:space="preserve"> advisements to be used to optimise </w:t>
       </w:r>
       <w:r>
         <w:rPr>
@@ -823,7 +829,7 @@
           <w:color w:val="000000"/>
           <w:lang w:eastAsia="en-GB"/>
         </w:rPr>
-        <w:t>puts forward experimental</w:t>
+        <w:t xml:space="preserve">the transcriptomics component </w:t>
       </w:r>
       <w:r>
         <w:rPr>
@@ -831,7 +837,7 @@
           <w:color w:val="000000"/>
           <w:lang w:eastAsia="en-GB"/>
         </w:rPr>
-        <w:t xml:space="preserve"> design</w:t>
+        <w:t>of</w:t>
       </w:r>
       <w:r>
         <w:rPr>
@@ -847,8 +853,7 @@
           <w:color w:val="000000"/>
           <w:lang w:eastAsia="en-GB"/>
         </w:rPr>
-        <w:lastRenderedPageBreak/>
-        <w:t xml:space="preserve">advisements to be used to optimise </w:t>
+        <w:t xml:space="preserve">future </w:t>
       </w:r>
       <w:r>
         <w:rPr>
@@ -856,7 +861,7 @@
           <w:color w:val="000000"/>
           <w:lang w:eastAsia="en-GB"/>
         </w:rPr>
-        <w:t xml:space="preserve">the transcriptomics component for </w:t>
+        <w:t xml:space="preserve">similar </w:t>
       </w:r>
       <w:r>
         <w:rPr>
@@ -864,15 +869,7 @@
           <w:color w:val="000000"/>
           <w:lang w:eastAsia="en-GB"/>
         </w:rPr>
-        <w:t xml:space="preserve">future iterations of </w:t>
-      </w:r>
-      <w:r>
-        <w:rPr>
-          <w:rFonts w:ascii="Aptos" w:eastAsia="Times New Roman" w:hAnsi="Aptos" w:cs="Calibri"/>
-          <w:color w:val="000000"/>
-          <w:lang w:eastAsia="en-GB"/>
-        </w:rPr>
-        <w:t>similar allergen studies.</w:t>
+        <w:t>allergen studies.</w:t>
       </w:r>
     </w:p>
     <w:p>
@@ -921,6 +918,34 @@
     <w:p>
       <w:r>
         <w:t>This study uses non-monetised software to perform transcriptomics on data previously acquired and analysed in [GH and WB., et al] in parallel with the service providers defined in the respective studies.</w:t>
+      </w:r>
+    </w:p>
+    <w:p>
+      <w:r>
+        <w:t>DE and pathway analysis results obtained by the service providers during the initial studies was used to validate this analysis pipeline; external results were only made available after this analysis was complete.</w:t>
+      </w:r>
+      <w:r>
+        <w:t xml:space="preserve"> </w:t>
+      </w:r>
+      <w:r>
+        <w:sym w:font="Wingdings" w:char="F0E0"/>
+      </w:r>
+      <w:r>
+        <w:t xml:space="preserve"> </w:t>
+      </w:r>
+      <w:r>
+        <w:rPr>
+          <w:b/>
+          <w:bCs/>
+        </w:rPr>
+        <w:t xml:space="preserve">was in paragraph 4. </w:t>
+      </w:r>
+      <w:r>
+        <w:rPr>
+          <w:b/>
+          <w:bCs/>
+        </w:rPr>
+        <w:t>I’ve removed this so I don’t have to treat it as a validation which would require a dedicated results section that I haven’t written</w:t>
       </w:r>
     </w:p>
     <w:p/>

</xml_diff>

<commit_message>
ADDING TODAY'S WORK - 26.07.2026
</commit_message>
<xml_diff>
--- a/write_up/drafts/2_introduction/introduction_DRAFT_2.docx
+++ b/write_up/drafts/2_introduction/introduction_DRAFT_2.docx
@@ -561,16 +561,25 @@
         </w:rPr>
       </w:pPr>
       <w:r>
-        <w:t xml:space="preserve">This study performs transcriptomics on data previously acquired and analysed in [GH and WB., et al]. Whereas the previous analyses employed monetised service providers to conduct transcriptomics, this study uses </w:t>
+        <w:t xml:space="preserve">This study performs transcriptomics on data previously acquired and analysed in [GH and WB., et al]. Whereas the previous analyses employed </w:t>
+      </w:r>
+      <w:r>
+        <w:t>commercial services and platforms</w:t>
+      </w:r>
+      <w:r>
+        <w:t xml:space="preserve"> to conduct transcriptomics, this study uses </w:t>
       </w:r>
       <w:r>
         <w:t xml:space="preserve">exclusively </w:t>
       </w:r>
       <w:r>
-        <w:t>non-monetised</w:t>
-      </w:r>
-      <w:r>
-        <w:t>, open-source</w:t>
+        <w:t>open-source and</w:t>
+      </w:r>
+      <w:r>
+        <w:t xml:space="preserve"> open-</w:t>
+      </w:r>
+      <w:r>
+        <w:t>access</w:t>
       </w:r>
       <w:r>
         <w:t xml:space="preserve"> software.</w:t>

</xml_diff>